<commit_message>
build: refresh six final DOCX and TXT reports and fixed source ZIP
</commit_message>
<xml_diff>
--- a/deliverables/final/第7组_4+n团队Sprint1自评报告.docx
+++ b/deliverables/final/第7组_4+n团队Sprint1自评报告.docx
@@ -28,7 +28,7 @@
     </w:p>
     <w:p>
       <w:r>
-        <w:t>本轮完成 US01、US04、US05 的开发和集成，实现本地成员查看、任务创建分配、状态更新的最小闭环。全量自动测试24/24通过，2026年9月22日人工Demo七项通过。五维自评采用范围“优”，进度、团队与AI、质量、风险均为“良”。等级依据项目证据分析形成，不假称经过全员投票。</w:t>
+        <w:t>本轮完成 US01、US04、US05 的开发和集成，实现本地成员查看、任务创建分配、状态更新的最小闭环。原业务自动测试24/24通过，最终加入05c7499服务状态修复后全量35/35通过；2026年9月22日人工Demo七项通过。五维自评采用范围“优”，进度、团队与AI、质量、风险均为“良”。等级依据项目证据分析形成，不假称经过全员投票。</w:t>
       </w:r>
     </w:p>
     <w:p>
@@ -78,10 +78,10 @@
         </w:tblBorders>
       </w:tblPr>
       <w:tblGrid>
-        <w:gridCol w:w="1569"/>
-        <w:gridCol w:w="1569"/>
-        <w:gridCol w:w="3776"/>
-        <w:gridCol w:w="2498"/>
+        <w:gridCol w:w="1526"/>
+        <w:gridCol w:w="1526"/>
+        <w:gridCol w:w="3928"/>
+        <w:gridCol w:w="2430"/>
       </w:tblGrid>
       <w:tr>
         <w:trPr>
@@ -90,7 +90,7 @@
         </w:trPr>
         <w:tc>
           <w:tcPr>
-            <w:tcW w:type="dxa" w:w="1569"/>
+            <w:tcW w:type="dxa" w:w="1526"/>
             <w:vAlign w:val="center"/>
             <w:tcMar>
               <w:top w:w="70" w:type="dxa"/>
@@ -102,6 +102,7 @@
           </w:tcPr>
           <w:p>
             <w:pPr>
+              <w:keepNext/>
               <w:spacing w:after="0" w:line="264" w:lineRule="auto"/>
               <w:jc w:val="center"/>
             </w:pPr>
@@ -118,7 +119,7 @@
         </w:tc>
         <w:tc>
           <w:tcPr>
-            <w:tcW w:type="dxa" w:w="1569"/>
+            <w:tcW w:type="dxa" w:w="1526"/>
             <w:vAlign w:val="center"/>
             <w:tcMar>
               <w:top w:w="70" w:type="dxa"/>
@@ -130,6 +131,7 @@
           </w:tcPr>
           <w:p>
             <w:pPr>
+              <w:keepNext/>
               <w:spacing w:after="0" w:line="264" w:lineRule="auto"/>
               <w:jc w:val="center"/>
             </w:pPr>
@@ -146,7 +148,7 @@
         </w:tc>
         <w:tc>
           <w:tcPr>
-            <w:tcW w:type="dxa" w:w="3776"/>
+            <w:tcW w:type="dxa" w:w="3928"/>
             <w:vAlign w:val="center"/>
             <w:tcMar>
               <w:top w:w="70" w:type="dxa"/>
@@ -158,6 +160,7 @@
           </w:tcPr>
           <w:p>
             <w:pPr>
+              <w:keepNext/>
               <w:spacing w:after="0" w:line="264" w:lineRule="auto"/>
               <w:jc w:val="center"/>
             </w:pPr>
@@ -174,7 +177,7 @@
         </w:tc>
         <w:tc>
           <w:tcPr>
-            <w:tcW w:type="dxa" w:w="2498"/>
+            <w:tcW w:type="dxa" w:w="2430"/>
             <w:vAlign w:val="center"/>
             <w:tcMar>
               <w:top w:w="70" w:type="dxa"/>
@@ -186,6 +189,7 @@
           </w:tcPr>
           <w:p>
             <w:pPr>
+              <w:keepNext/>
               <w:spacing w:after="0" w:line="264" w:lineRule="auto"/>
               <w:jc w:val="center"/>
             </w:pPr>
@@ -207,7 +211,7 @@
         </w:trPr>
         <w:tc>
           <w:tcPr>
-            <w:tcW w:type="dxa" w:w="1569"/>
+            <w:tcW w:type="dxa" w:w="1526"/>
             <w:vAlign w:val="center"/>
             <w:tcMar>
               <w:top w:w="70" w:type="dxa"/>
@@ -234,7 +238,7 @@
         </w:tc>
         <w:tc>
           <w:tcPr>
-            <w:tcW w:type="dxa" w:w="1569"/>
+            <w:tcW w:type="dxa" w:w="1526"/>
             <w:vAlign w:val="center"/>
             <w:tcMar>
               <w:top w:w="70" w:type="dxa"/>
@@ -261,7 +265,7 @@
         </w:tc>
         <w:tc>
           <w:tcPr>
-            <w:tcW w:type="dxa" w:w="3776"/>
+            <w:tcW w:type="dxa" w:w="3928"/>
             <w:vAlign w:val="center"/>
             <w:tcMar>
               <w:top w:w="70" w:type="dxa"/>
@@ -287,7 +291,7 @@
         </w:tc>
         <w:tc>
           <w:tcPr>
-            <w:tcW w:type="dxa" w:w="2498"/>
+            <w:tcW w:type="dxa" w:w="2430"/>
             <w:vAlign w:val="center"/>
             <w:tcMar>
               <w:top w:w="70" w:type="dxa"/>
@@ -318,7 +322,7 @@
         </w:trPr>
         <w:tc>
           <w:tcPr>
-            <w:tcW w:type="dxa" w:w="1569"/>
+            <w:tcW w:type="dxa" w:w="1526"/>
             <w:vAlign w:val="center"/>
             <w:tcMar>
               <w:top w:w="70" w:type="dxa"/>
@@ -345,7 +349,7 @@
         </w:tc>
         <w:tc>
           <w:tcPr>
-            <w:tcW w:type="dxa" w:w="1569"/>
+            <w:tcW w:type="dxa" w:w="1526"/>
             <w:vAlign w:val="center"/>
             <w:tcMar>
               <w:top w:w="70" w:type="dxa"/>
@@ -372,7 +376,7 @@
         </w:tc>
         <w:tc>
           <w:tcPr>
-            <w:tcW w:type="dxa" w:w="3776"/>
+            <w:tcW w:type="dxa" w:w="3928"/>
             <w:vAlign w:val="center"/>
             <w:tcMar>
               <w:top w:w="70" w:type="dxa"/>
@@ -398,7 +402,7 @@
         </w:tc>
         <w:tc>
           <w:tcPr>
-            <w:tcW w:type="dxa" w:w="2498"/>
+            <w:tcW w:type="dxa" w:w="2430"/>
             <w:vAlign w:val="center"/>
             <w:tcMar>
               <w:top w:w="70" w:type="dxa"/>
@@ -429,7 +433,7 @@
         </w:trPr>
         <w:tc>
           <w:tcPr>
-            <w:tcW w:type="dxa" w:w="1569"/>
+            <w:tcW w:type="dxa" w:w="1526"/>
             <w:vAlign w:val="center"/>
             <w:tcMar>
               <w:top w:w="70" w:type="dxa"/>
@@ -456,7 +460,7 @@
         </w:tc>
         <w:tc>
           <w:tcPr>
-            <w:tcW w:type="dxa" w:w="1569"/>
+            <w:tcW w:type="dxa" w:w="1526"/>
             <w:vAlign w:val="center"/>
             <w:tcMar>
               <w:top w:w="70" w:type="dxa"/>
@@ -483,7 +487,7 @@
         </w:tc>
         <w:tc>
           <w:tcPr>
-            <w:tcW w:type="dxa" w:w="3776"/>
+            <w:tcW w:type="dxa" w:w="3928"/>
             <w:vAlign w:val="center"/>
             <w:tcMar>
               <w:top w:w="70" w:type="dxa"/>
@@ -509,7 +513,7 @@
         </w:tc>
         <w:tc>
           <w:tcPr>
-            <w:tcW w:type="dxa" w:w="2498"/>
+            <w:tcW w:type="dxa" w:w="2430"/>
             <w:vAlign w:val="center"/>
             <w:tcMar>
               <w:top w:w="70" w:type="dxa"/>
@@ -540,7 +544,7 @@
         </w:trPr>
         <w:tc>
           <w:tcPr>
-            <w:tcW w:type="dxa" w:w="1569"/>
+            <w:tcW w:type="dxa" w:w="1526"/>
             <w:vAlign w:val="center"/>
             <w:tcMar>
               <w:top w:w="70" w:type="dxa"/>
@@ -567,7 +571,7 @@
         </w:tc>
         <w:tc>
           <w:tcPr>
-            <w:tcW w:type="dxa" w:w="1569"/>
+            <w:tcW w:type="dxa" w:w="1526"/>
             <w:vAlign w:val="center"/>
             <w:tcMar>
               <w:top w:w="70" w:type="dxa"/>
@@ -594,7 +598,7 @@
         </w:tc>
         <w:tc>
           <w:tcPr>
-            <w:tcW w:type="dxa" w:w="3776"/>
+            <w:tcW w:type="dxa" w:w="3928"/>
             <w:vAlign w:val="center"/>
             <w:tcMar>
               <w:top w:w="70" w:type="dxa"/>
@@ -614,13 +618,13 @@
                 <w:color w:val="000000"/>
                 <w:sz w:val="20"/>
               </w:rPr>
-              <w:t>24/24测试，七项人工Demo，边界与持久化验证</w:t>
+              <w:t>最终35/35，原24/24及七项人工Demo保留，边界与持久化验证</w:t>
             </w:r>
           </w:p>
         </w:tc>
         <w:tc>
           <w:tcPr>
-            <w:tcW w:type="dxa" w:w="2498"/>
+            <w:tcW w:type="dxa" w:w="2430"/>
             <w:vAlign w:val="center"/>
             <w:tcMar>
               <w:top w:w="70" w:type="dxa"/>
@@ -651,7 +655,7 @@
         </w:trPr>
         <w:tc>
           <w:tcPr>
-            <w:tcW w:type="dxa" w:w="1569"/>
+            <w:tcW w:type="dxa" w:w="1526"/>
             <w:vAlign w:val="center"/>
             <w:tcMar>
               <w:top w:w="70" w:type="dxa"/>
@@ -678,7 +682,7 @@
         </w:tc>
         <w:tc>
           <w:tcPr>
-            <w:tcW w:type="dxa" w:w="1569"/>
+            <w:tcW w:type="dxa" w:w="1526"/>
             <w:vAlign w:val="center"/>
             <w:tcMar>
               <w:top w:w="70" w:type="dxa"/>
@@ -705,7 +709,7 @@
         </w:tc>
         <w:tc>
           <w:tcPr>
-            <w:tcW w:type="dxa" w:w="3776"/>
+            <w:tcW w:type="dxa" w:w="3928"/>
             <w:vAlign w:val="center"/>
             <w:tcMar>
               <w:top w:w="70" w:type="dxa"/>
@@ -731,7 +735,7 @@
         </w:tc>
         <w:tc>
           <w:tcPr>
-            <w:tcW w:type="dxa" w:w="2498"/>
+            <w:tcW w:type="dxa" w:w="2430"/>
             <w:vAlign w:val="center"/>
             <w:tcMar>
               <w:top w:w="70" w:type="dxa"/>
@@ -854,7 +858,7 @@
     </w:p>
     <w:p>
       <w:r>
-        <w:t>自评为良。证据为docs/evidence/us01-tests.tap、us01-browser-results.json、截图、用户Demo确认及本次sprint1-final-test-20261008.txt。AI静态审查未见Blocker/Major，发现状态常量重复与静态健康提示两个Minor。这些结论只在当前范围有效，不等于没有潜在缺陷或正式全DoD通过。</w:t>
+        <w:t>自评为良。历史证据为docs/evidence/us01-tests.tap、us01-browser-results.json、截图、用户Demo确认及修复前sprint1-final-test-20261008.txt。原审查发现两个Minor；静态服务状态已在05c7499修复，状态枚举重复继续保留。最终测试新增服务状态11项，总计35/35，0失败，见sprint1-integrated-test-20261008.txt。隔离浏览器三种状态、单成员请求、创建分配、状态流转和刷新保留均通过，console error为空。这些结论不等于全部业务健康或正式全DoD通过。</w:t>
       </w:r>
     </w:p>
     <w:p>
@@ -905,7 +909,7 @@
     </w:p>
     <w:p>
       <w:r>
-        <w:t>代码审查智能体方面，静态审查关注共享模型、非法输入、注释和范围，未见当前阻断问题，保留两个Minor及后续异常风险。AI审查可以提出具体问题，但同属自动化工具，不能给人工Review项提供独立人类确认。</w:t>
+        <w:t>代码审查智能体方面，静态审查关注共享模型、非法输入、注释和范围，未见当前阻断问题。原两个Minor记录保留，静态状态在05c7499修复，状态枚举重复及后续异常风险仍在。AI审查可以提出具体问题，但同属自动化工具，不能给人工Review项提供独立人类确认。</w:t>
       </w:r>
     </w:p>
     <w:p>

</xml_diff>